<commit_message>
Store daily recap Word us_market_recap_2026-10-20_BJT_us_2026-10-19_final
</commit_message>
<xml_diff>
--- a/reports/us_market_recap_2026-10-20_BJT_us_2026-10-19_final.docx
+++ b/reports/us_market_recap_2026-10-20_BJT_us_2026-10-19_final.docx
@@ -1013,7 +1013,7 @@
                 <w:color w:val="141414"/>
                 <w:sz w:val="16"/>
               </w:rPr>
-              <w:t>101.97 / 98.26 / 8.20万美元</w:t>
+              <w:t>101.96 / 98.17 / 8.18万美元</w:t>
             </w:r>
           </w:p>
         </w:tc>
@@ -1040,7 +1040,7 @@
                 <w:color w:val="141414"/>
                 <w:sz w:val="16"/>
               </w:rPr>
-              <w:t>DXY +0.13% / WTI -3.11% / BTC -0.04%</w:t>
+              <w:t>DXY +0.11% / WTI -3.19% / BTC -0.30%</w:t>
             </w:r>
           </w:p>
         </w:tc>
@@ -3824,7 +3824,7 @@
                 <w:color w:val="141414"/>
                 <w:sz w:val="16"/>
               </w:rPr>
-              <w:t>价格 +6.65%；成交 1.68x均量</w:t>
+              <w:t>价格 +6.65%；成交 1.60x均量</w:t>
             </w:r>
           </w:p>
         </w:tc>
@@ -3935,7 +3935,7 @@
                 <w:color w:val="141414"/>
                 <w:sz w:val="16"/>
               </w:rPr>
-              <w:t>价格 +6.09%；成交 0.94x均量</w:t>
+              <w:t>价格 +6.09%；成交 1.23x均量</w:t>
             </w:r>
           </w:p>
         </w:tc>
@@ -4046,7 +4046,7 @@
                 <w:color w:val="141414"/>
                 <w:sz w:val="16"/>
               </w:rPr>
-              <w:t>价格 +5.53%；成交 0.93x均量</w:t>
+              <w:t>价格 +5.53%；成交 1.35x均量</w:t>
             </w:r>
           </w:p>
         </w:tc>
@@ -4157,7 +4157,7 @@
                 <w:color w:val="141414"/>
                 <w:sz w:val="16"/>
               </w:rPr>
-              <w:t>价格 +5.36%；成交 0.95x均量</w:t>
+              <w:t>价格 +5.36%；成交 0.77x均量</w:t>
             </w:r>
           </w:p>
         </w:tc>
@@ -4268,7 +4268,7 @@
                 <w:color w:val="141414"/>
                 <w:sz w:val="16"/>
               </w:rPr>
-              <w:t>价格 +4.98%；成交 1.57x均量</w:t>
+              <w:t>价格 +4.98%；成交 5.47x均量</w:t>
             </w:r>
           </w:p>
         </w:tc>
@@ -4379,7 +4379,7 @@
                 <w:color w:val="141414"/>
                 <w:sz w:val="16"/>
               </w:rPr>
-              <w:t>价格 -4.21%；成交 1.04x均量</w:t>
+              <w:t>价格 -4.21%；成交 1.39x均量</w:t>
             </w:r>
           </w:p>
         </w:tc>
@@ -4893,7 +4893,7 @@
         <w:t>APLD</w:t>
       </w:r>
       <w:r>
-        <w:t xml:space="preserve"> +6.65%（成交约1.68x均量）；</w:t>
+        <w:t xml:space="preserve"> +6.65%（成交约1.60x均量）；</w:t>
       </w:r>
       <w:r>
         <w:rPr>
@@ -4902,7 +4902,7 @@
         <w:t>WDC</w:t>
       </w:r>
       <w:r>
-        <w:t xml:space="preserve"> +6.09%（成交约0.94x均量）；</w:t>
+        <w:t xml:space="preserve"> +6.09%（成交约1.23x均量）；</w:t>
       </w:r>
       <w:r>
         <w:rPr>
@@ -4911,7 +4911,7 @@
         <w:t>SNDK</w:t>
       </w:r>
       <w:r>
-        <w:t xml:space="preserve"> +5.53%（成交约0.93x均量）；</w:t>
+        <w:t xml:space="preserve"> +5.53%（成交约1.35x均量）；</w:t>
       </w:r>
       <w:r>
         <w:rPr>
@@ -4920,7 +4920,7 @@
         <w:t>DDOG</w:t>
       </w:r>
       <w:r>
-        <w:t xml:space="preserve"> +5.36%（成交约0.95x均量）；</w:t>
+        <w:t xml:space="preserve"> +5.36%（成交约0.77x均量）；</w:t>
       </w:r>
       <w:r>
         <w:rPr>
@@ -4929,7 +4929,7 @@
         <w:t>AMZN</w:t>
       </w:r>
       <w:r>
-        <w:t xml:space="preserve"> +4.98%（成交约1.57x均量）；</w:t>
+        <w:t xml:space="preserve"> +4.98%（成交约5.47x均量）；</w:t>
       </w:r>
       <w:r>
         <w:rPr>
@@ -4938,7 +4938,7 @@
         <w:t>NRG</w:t>
       </w:r>
       <w:r>
-        <w:t xml:space="preserve"> -4.21%（成交约1.04x均量）。这些名字先记录为价格/成交异常，随后核对同日公告、研报、公司交流、行业数据或传闻原始出处；没有证据时保留“待验”，不把涨跌倒推成原因。</w:t>
+        <w:t xml:space="preserve"> -4.21%（成交约1.39x均量）。这些名字先记录为价格/成交异常，随后核对同日公告、研报、公司交流、行业数据或传闻原始出处；没有证据时保留“待验”，不把涨跌倒推成原因。</w:t>
       </w:r>
     </w:p>
     <w:p>
@@ -6257,7 +6257,7 @@
                 <w:color w:val="141414"/>
                 <w:sz w:val="16"/>
               </w:rPr>
-              <w:t>1.04x均量</w:t>
+              <w:t>1.39x均量</w:t>
             </w:r>
           </w:p>
         </w:tc>
@@ -6368,7 +6368,7 @@
                 <w:color w:val="141414"/>
                 <w:sz w:val="16"/>
               </w:rPr>
-              <w:t>0.97x均量</w:t>
+              <w:t>0.82x均量</w:t>
             </w:r>
           </w:p>
         </w:tc>
@@ -6479,7 +6479,7 @@
                 <w:color w:val="141414"/>
                 <w:sz w:val="16"/>
               </w:rPr>
-              <w:t>0.81x均量</w:t>
+              <w:t>0.64x均量</w:t>
             </w:r>
           </w:p>
         </w:tc>
@@ -6590,7 +6590,7 @@
                 <w:color w:val="141414"/>
                 <w:sz w:val="16"/>
               </w:rPr>
-              <w:t>1.06x均量</w:t>
+              <w:t>1.65x均量</w:t>
             </w:r>
           </w:p>
         </w:tc>
@@ -6701,7 +6701,7 @@
                 <w:color w:val="141414"/>
                 <w:sz w:val="16"/>
               </w:rPr>
-              <w:t>0.73x均量</w:t>
+              <w:t>0.67x均量</w:t>
             </w:r>
           </w:p>
         </w:tc>
@@ -6812,7 +6812,7 @@
                 <w:color w:val="141414"/>
                 <w:sz w:val="16"/>
               </w:rPr>
-              <w:t>1.20x均量</w:t>
+              <w:t>1.00x均量</w:t>
             </w:r>
           </w:p>
         </w:tc>
@@ -7178,7 +7178,7 @@
                 <w:color w:val="141414"/>
                 <w:sz w:val="16"/>
               </w:rPr>
-              <w:t>不可得</w:t>
+              <w:t>2026-10-23</w:t>
             </w:r>
           </w:p>
         </w:tc>
@@ -7204,7 +7204,7 @@
                 <w:color w:val="141414"/>
                 <w:sz w:val="16"/>
               </w:rPr>
-              <w:t>nan</w:t>
+              <w:t>2.83</w:t>
             </w:r>
           </w:p>
         </w:tc>
@@ -7230,7 +7230,7 @@
                 <w:color w:val="141414"/>
                 <w:sz w:val="16"/>
               </w:rPr>
-              <w:t>nan%</w:t>
+              <w:t>9.9%</w:t>
             </w:r>
           </w:p>
         </w:tc>
@@ -7256,7 +7256,7 @@
                 <w:color w:val="141414"/>
                 <w:sz w:val="16"/>
               </w:rPr>
-              <w:t>source unavailable</w:t>
+              <w:t>无阈值报警</w:t>
             </w:r>
           </w:p>
         </w:tc>
@@ -7450,7 +7450,7 @@
                 <w:color w:val="141414"/>
                 <w:sz w:val="16"/>
               </w:rPr>
-              <w:t>不可得</w:t>
+              <w:t>2026-10-23</w:t>
             </w:r>
           </w:p>
         </w:tc>
@@ -7476,7 +7476,7 @@
                 <w:color w:val="141414"/>
                 <w:sz w:val="16"/>
               </w:rPr>
-              <w:t>nan</w:t>
+              <w:t>1.45</w:t>
             </w:r>
           </w:p>
         </w:tc>
@@ -7502,7 +7502,7 @@
                 <w:color w:val="141414"/>
                 <w:sz w:val="16"/>
               </w:rPr>
-              <w:t>nan%</w:t>
+              <w:t>18.9%</w:t>
             </w:r>
           </w:p>
         </w:tc>
@@ -7528,7 +7528,7 @@
                 <w:color w:val="141414"/>
                 <w:sz w:val="16"/>
               </w:rPr>
-              <w:t>source unavailable</w:t>
+              <w:t>strike-concentration</w:t>
             </w:r>
           </w:p>
         </w:tc>
@@ -7722,7 +7722,7 @@
                 <w:color w:val="141414"/>
                 <w:sz w:val="16"/>
               </w:rPr>
-              <w:t>不可得</w:t>
+              <w:t>2026-10-30</w:t>
             </w:r>
           </w:p>
         </w:tc>
@@ -7748,7 +7748,7 @@
                 <w:color w:val="141414"/>
                 <w:sz w:val="16"/>
               </w:rPr>
-              <w:t>nan</w:t>
+              <w:t>1.68</w:t>
             </w:r>
           </w:p>
         </w:tc>
@@ -7774,7 +7774,7 @@
                 <w:color w:val="141414"/>
                 <w:sz w:val="16"/>
               </w:rPr>
-              <w:t>nan%</w:t>
+              <w:t>9.0%</w:t>
             </w:r>
           </w:p>
         </w:tc>
@@ -7800,7 +7800,7 @@
                 <w:color w:val="141414"/>
                 <w:sz w:val="16"/>
               </w:rPr>
-              <w:t>source unavailable</w:t>
+              <w:t>无阈值报警</w:t>
             </w:r>
           </w:p>
         </w:tc>
@@ -7858,7 +7858,7 @@
                 <w:color w:val="141414"/>
                 <w:sz w:val="16"/>
               </w:rPr>
-              <w:t>不可得</w:t>
+              <w:t>2026-10-23</w:t>
             </w:r>
           </w:p>
         </w:tc>
@@ -7884,7 +7884,7 @@
                 <w:color w:val="141414"/>
                 <w:sz w:val="16"/>
               </w:rPr>
-              <w:t>nan</w:t>
+              <w:t>1.71</w:t>
             </w:r>
           </w:p>
         </w:tc>
@@ -7910,7 +7910,7 @@
                 <w:color w:val="141414"/>
                 <w:sz w:val="16"/>
               </w:rPr>
-              <w:t>nan%</w:t>
+              <w:t>10.6%</w:t>
             </w:r>
           </w:p>
         </w:tc>
@@ -7936,7 +7936,7 @@
                 <w:color w:val="141414"/>
                 <w:sz w:val="16"/>
               </w:rPr>
-              <w:t>source unavailable</w:t>
+              <w:t>call-heavy, strike-concentration</w:t>
             </w:r>
           </w:p>
         </w:tc>
@@ -7994,7 +7994,7 @@
                 <w:color w:val="141414"/>
                 <w:sz w:val="16"/>
               </w:rPr>
-              <w:t>不可得</w:t>
+              <w:t>2026-10-30</w:t>
             </w:r>
           </w:p>
         </w:tc>
@@ -8020,7 +8020,7 @@
                 <w:color w:val="141414"/>
                 <w:sz w:val="16"/>
               </w:rPr>
-              <w:t>nan</w:t>
+              <w:t>1.85</w:t>
             </w:r>
           </w:p>
         </w:tc>
@@ -8046,7 +8046,7 @@
                 <w:color w:val="141414"/>
                 <w:sz w:val="16"/>
               </w:rPr>
-              <w:t>nan%</w:t>
+              <w:t>12.0%</w:t>
             </w:r>
           </w:p>
         </w:tc>
@@ -8072,7 +8072,7 @@
                 <w:color w:val="141414"/>
                 <w:sz w:val="16"/>
               </w:rPr>
-              <w:t>source unavailable</w:t>
+              <w:t>无阈值报警</w:t>
             </w:r>
           </w:p>
         </w:tc>
@@ -8130,7 +8130,7 @@
                 <w:color w:val="141414"/>
                 <w:sz w:val="16"/>
               </w:rPr>
-              <w:t>不可得</w:t>
+              <w:t>2026-10-30</w:t>
             </w:r>
           </w:p>
         </w:tc>
@@ -8156,7 +8156,7 @@
                 <w:color w:val="141414"/>
                 <w:sz w:val="16"/>
               </w:rPr>
-              <w:t>nan</w:t>
+              <w:t>1.94</w:t>
             </w:r>
           </w:p>
         </w:tc>
@@ -8182,7 +8182,7 @@
                 <w:color w:val="141414"/>
                 <w:sz w:val="16"/>
               </w:rPr>
-              <w:t>nan%</w:t>
+              <w:t>7.7%</w:t>
             </w:r>
           </w:p>
         </w:tc>
@@ -8208,7 +8208,7 @@
                 <w:color w:val="141414"/>
                 <w:sz w:val="16"/>
               </w:rPr>
-              <w:t>source unavailable</w:t>
+              <w:t>无阈值报警</w:t>
             </w:r>
           </w:p>
         </w:tc>
@@ -8266,7 +8266,7 @@
                 <w:color w:val="141414"/>
                 <w:sz w:val="16"/>
               </w:rPr>
-              <w:t>不可得</w:t>
+              <w:t>2026-10-30</w:t>
             </w:r>
           </w:p>
         </w:tc>
@@ -8292,7 +8292,7 @@
                 <w:color w:val="141414"/>
                 <w:sz w:val="16"/>
               </w:rPr>
-              <w:t>nan</w:t>
+              <w:t>1.87</w:t>
             </w:r>
           </w:p>
         </w:tc>
@@ -8318,7 +8318,7 @@
                 <w:color w:val="141414"/>
                 <w:sz w:val="16"/>
               </w:rPr>
-              <w:t>nan%</w:t>
+              <w:t>11.2%</w:t>
             </w:r>
           </w:p>
         </w:tc>
@@ -8344,7 +8344,7 @@
                 <w:color w:val="141414"/>
                 <w:sz w:val="16"/>
               </w:rPr>
-              <w:t>source unavailable</w:t>
+              <w:t>strike-concentration</w:t>
             </w:r>
           </w:p>
         </w:tc>
@@ -8402,7 +8402,7 @@
                 <w:color w:val="141414"/>
                 <w:sz w:val="16"/>
               </w:rPr>
-              <w:t>不可得</w:t>
+              <w:t>2026-11-20</w:t>
             </w:r>
           </w:p>
         </w:tc>
@@ -8428,7 +8428,7 @@
                 <w:color w:val="141414"/>
                 <w:sz w:val="16"/>
               </w:rPr>
-              <w:t>nan</w:t>
+              <w:t>1.55</w:t>
             </w:r>
           </w:p>
         </w:tc>
@@ -8454,7 +8454,7 @@
                 <w:color w:val="141414"/>
                 <w:sz w:val="16"/>
               </w:rPr>
-              <w:t>nan%</w:t>
+              <w:t>30.9%</w:t>
             </w:r>
           </w:p>
         </w:tc>
@@ -8480,7 +8480,7 @@
                 <w:color w:val="141414"/>
                 <w:sz w:val="16"/>
               </w:rPr>
-              <w:t>source unavailable</w:t>
+              <w:t>strike-concentration</w:t>
             </w:r>
           </w:p>
         </w:tc>
@@ -8538,7 +8538,7 @@
                 <w:color w:val="141414"/>
                 <w:sz w:val="16"/>
               </w:rPr>
-              <w:t>不可得</w:t>
+              <w:t>2026-10-23</w:t>
             </w:r>
           </w:p>
         </w:tc>
@@ -8564,7 +8564,7 @@
                 <w:color w:val="141414"/>
                 <w:sz w:val="16"/>
               </w:rPr>
-              <w:t>nan</w:t>
+              <w:t>1.52</w:t>
             </w:r>
           </w:p>
         </w:tc>
@@ -8590,7 +8590,7 @@
                 <w:color w:val="141414"/>
                 <w:sz w:val="16"/>
               </w:rPr>
-              <w:t>nan%</w:t>
+              <w:t>10.1%</w:t>
             </w:r>
           </w:p>
         </w:tc>
@@ -8616,7 +8616,7 @@
                 <w:color w:val="141414"/>
                 <w:sz w:val="16"/>
               </w:rPr>
-              <w:t>source unavailable</w:t>
+              <w:t>call-heavy, call-volume/OI&gt;=2</w:t>
             </w:r>
           </w:p>
         </w:tc>
@@ -8946,7 +8946,7 @@
                 <w:color w:val="141414"/>
                 <w:sz w:val="16"/>
               </w:rPr>
-              <w:t>不可得</w:t>
+              <w:t>2026-10-23</w:t>
             </w:r>
           </w:p>
         </w:tc>
@@ -8972,7 +8972,7 @@
                 <w:color w:val="141414"/>
                 <w:sz w:val="16"/>
               </w:rPr>
-              <w:t>nan</w:t>
+              <w:t>2.83</w:t>
             </w:r>
           </w:p>
         </w:tc>
@@ -8998,7 +8998,7 @@
                 <w:color w:val="141414"/>
                 <w:sz w:val="16"/>
               </w:rPr>
-              <w:t>nan%</w:t>
+              <w:t>13.6%</w:t>
             </w:r>
           </w:p>
         </w:tc>
@@ -9024,7 +9024,7 @@
                 <w:color w:val="141414"/>
                 <w:sz w:val="16"/>
               </w:rPr>
-              <w:t>source unavailable</w:t>
+              <w:t>无阈值报警</w:t>
             </w:r>
           </w:p>
         </w:tc>
@@ -9179,7 +9179,7 @@
       <w:r>
         <w:drawing>
           <wp:inline xmlns:a="http://schemas.openxmlformats.org/drawingml/2006/main" xmlns:pic="http://schemas.openxmlformats.org/drawingml/2006/picture">
-            <wp:extent cx="5806440" cy="3922558"/>
+            <wp:extent cx="5806440" cy="2733605"/>
             <wp:docPr id="25" name="Picture 25"/>
             <wp:cNvGraphicFramePr>
               <a:graphicFrameLocks noChangeAspect="1"/>
@@ -9200,7 +9200,7 @@
                   <pic:spPr>
                     <a:xfrm>
                       <a:off x="0" y="0"/>
-                      <a:ext cx="5806440" cy="3922558"/>
+                      <a:ext cx="5806440" cy="2733605"/>
                     </a:xfrm>
                     <a:prstGeom prst="rect"/>
                   </pic:spPr>
@@ -9221,7 +9221,7 @@
           <w:color w:val="555555"/>
           <w:sz w:val="17"/>
         </w:rPr>
-        <w:t>图：公开期权链异常扫描。来源/口径：Nasdaq public option-chain endpoint；检查时点 2026-10-19T19:39:24-04:00；无执行方向确认。。</w:t>
+        <w:t>图：公开期权链异常扫描。来源/口径：Nasdaq public option-chain endpoint；检查时点 2026-10-19T20:13:05-04:00；无执行方向确认。。</w:t>
       </w:r>
     </w:p>
     <w:p>
@@ -9230,15 +9230,6 @@
       </w:pPr>
       <w:r>
         <w:t xml:space="preserve">解读规则：本次触发异常阈值的标的为 </w:t>
-      </w:r>
-      <w:r>
-        <w:rPr>
-          <w:shd w:fill="E7E6E6"/>
-        </w:rPr>
-        <w:t>LITE</w:t>
-      </w:r>
-      <w:r>
-        <w:t xml:space="preserve">, </w:t>
       </w:r>
       <w:r>
         <w:rPr>
@@ -9262,34 +9253,7 @@
         <w:rPr>
           <w:shd w:fill="E7E6E6"/>
         </w:rPr>
-        <w:t>MU</w:t>
-      </w:r>
-      <w:r>
-        <w:t xml:space="preserve">, </w:t>
-      </w:r>
-      <w:r>
-        <w:rPr>
-          <w:shd w:fill="E7E6E6"/>
-        </w:rPr>
         <w:t>SNDK</w:t>
-      </w:r>
-      <w:r>
-        <w:t xml:space="preserve">, </w:t>
-      </w:r>
-      <w:r>
-        <w:rPr>
-          <w:shd w:fill="E7E6E6"/>
-        </w:rPr>
-        <w:t>NVDA</w:t>
-      </w:r>
-      <w:r>
-        <w:t xml:space="preserve">, </w:t>
-      </w:r>
-      <w:r>
-        <w:rPr>
-          <w:shd w:fill="E7E6E6"/>
-        </w:rPr>
-        <w:t>AVGO</w:t>
       </w:r>
       <w:r>
         <w:t xml:space="preserve">, </w:t>
@@ -9320,15 +9284,6 @@
       </w:r>
       <w:r>
         <w:t>TWST</w:t>
-      </w:r>
-      <w:r>
-        <w:t xml:space="preserve">, </w:t>
-      </w:r>
-      <w:r>
-        <w:rPr>
-          <w:shd w:fill="E7E6E6"/>
-        </w:rPr>
-        <w:t>MRVL</w:t>
       </w:r>
       <w:r>
         <w:t xml:space="preserve">, </w:t>
@@ -9371,7 +9326,7 @@
       <w:r>
         <w:drawing>
           <wp:inline xmlns:a="http://schemas.openxmlformats.org/drawingml/2006/main" xmlns:pic="http://schemas.openxmlformats.org/drawingml/2006/picture">
-            <wp:extent cx="5806440" cy="1988462"/>
+            <wp:extent cx="5806440" cy="3193704"/>
             <wp:docPr id="26" name="Picture 26"/>
             <wp:cNvGraphicFramePr>
               <a:graphicFrameLocks noChangeAspect="1"/>
@@ -9392,7 +9347,7 @@
                   <pic:spPr>
                     <a:xfrm>
                       <a:off x="0" y="0"/>
-                      <a:ext cx="5806440" cy="1988462"/>
+                      <a:ext cx="5806440" cy="3193704"/>
                     </a:xfrm>
                     <a:prstGeom prst="rect"/>
                   </pic:spPr>

</xml_diff>